<commit_message>
fix(p4): one «Адрес:» label before addresses in CT-1 / Fito
The templates print «Адрес:» before the sender and consignee addresses; a
label typed into the firm card («Юр.Адрес:», «Юридический адрес:»,
«Address:» … seven spellings in the data) is stripped, and a blank address
prints no line. ct1_ru / fito_ru regenerated from build_templates.py.

Co-Authored-By: Claude Opus 5.5 <noreply@anthropic.com>
</commit_message>
<xml_diff>
--- a/backend/apps/contracts/document_templates/ct1_ru.docx
+++ b/backend/apps/contracts/document_templates/ct1_ru.docx
@@ -66,7 +66,7 @@
           <w:b w:val="0"/>
           <w:sz w:val="24"/>
         </w:rPr>
-        <w:t>{{ firm_address }}</w:t>
+        <w:t>{% if firm_address %}Адрес: {{ firm_address }}{% endif %}</w:t>
       </w:r>
     </w:p>
     <w:p/>
@@ -85,7 +85,7 @@
           <w:b w:val="0"/>
           <w:sz w:val="18"/>
         </w:rPr>
-        <w:t>{{ buyer_address }}</w:t>
+        <w:t>{% if buyer_address %}Адрес: {{ buyer_address }}{% endif %}</w:t>
       </w:r>
     </w:p>
     <w:p/>

</xml_diff>